<commit_message>
Date Minnesota Surgical Society 2026 talks to October 2026
Both Minnesota Surgical Society Annual Meeting 2026 oral presentations
(the Area Deprivation Index paper and the MOSI paper) carried a bare
year with no month, so they sorted to the bottom of the presentations
list. Set them to Oct 2026 to match the meeting date and the CSV's
'Mon YYYY' convention.

They now sort directly after the Jan 2027 ASPN talk, and the MOSI
presenter attribution is unchanged.

The PDF is left for CI to rebuild with LibreOffice rather than
committing the sandbox WeasyPrint fallback.

Co-Authored-By: Claude Opus 5 <noreply@anthropic.com>
Claude-Session: https://claude.ai/code/session_01Mvoqy98ifTezCDCHR5sSsp
</commit_message>
<xml_diff>
--- a/Shahriarirad_Reza_CV.docx
+++ b/Shahriarirad_Reza_CV.docx
@@ -20284,6 +20284,220 @@
                 <w:i w:val="0"/>
                 <w:sz w:val="17"/>
               </w:rPr>
+              <w:t>Oct 2026</w:t>
+            </w:r>
+          </w:p>
+        </w:tc>
+        <w:tc>
+          <w:tcPr>
+            <w:tcW w:type="dxa" w:w="1008"/>
+            <w:vAlign w:val="center"/>
+          </w:tcPr>
+          <w:p>
+            <w:pPr>
+              <w:spacing w:after="0"/>
+            </w:pPr>
+            <w:r/>
+            <w:r>
+              <w:rPr>
+                <w:rFonts w:ascii="Arial" w:hAnsi="Arial" w:eastAsia="Arial"/>
+                <w:b w:val="0"/>
+                <w:i w:val="0"/>
+                <w:sz w:val="17"/>
+              </w:rPr>
+              <w:t>Oral</w:t>
+            </w:r>
+          </w:p>
+        </w:tc>
+        <w:tc>
+          <w:tcPr>
+            <w:tcW w:type="dxa" w:w="4464"/>
+            <w:vAlign w:val="center"/>
+          </w:tcPr>
+          <w:p>
+            <w:pPr>
+              <w:spacing w:after="0"/>
+            </w:pPr>
+            <w:r/>
+            <w:r>
+              <w:rPr>
+                <w:rFonts w:ascii="Arial" w:hAnsi="Arial" w:eastAsia="Arial"/>
+                <w:b w:val="0"/>
+                <w:i w:val="0"/>
+                <w:sz w:val="17"/>
+              </w:rPr>
+              <w:t>Area Deprivation Index, Social Determinants of Health, and Weight-Loss Outcomes After Bariatric Surgery: A Retrospective Referral-Center Cohort Study</w:t>
+            </w:r>
+          </w:p>
+        </w:tc>
+        <w:tc>
+          <w:tcPr>
+            <w:tcW w:type="dxa" w:w="2880"/>
+            <w:vAlign w:val="center"/>
+          </w:tcPr>
+          <w:p>
+            <w:pPr>
+              <w:spacing w:after="0"/>
+            </w:pPr>
+            <w:r/>
+            <w:r>
+              <w:rPr>
+                <w:rFonts w:ascii="Arial" w:hAnsi="Arial" w:eastAsia="Arial"/>
+                <w:b w:val="0"/>
+                <w:i w:val="0"/>
+                <w:sz w:val="17"/>
+              </w:rPr>
+              <w:t>Minnesota Surgical Society Annual Meeting 2026; United States</w:t>
+            </w:r>
+          </w:p>
+        </w:tc>
+      </w:tr>
+      <w:tr>
+        <w:tc>
+          <w:tcPr>
+            <w:tcW w:type="dxa" w:w="504"/>
+            <w:vAlign w:val="center"/>
+          </w:tcPr>
+          <w:p>
+            <w:pPr>
+              <w:spacing w:after="0"/>
+            </w:pPr>
+            <w:r/>
+            <w:r>
+              <w:rPr>
+                <w:rFonts w:ascii="Arial" w:hAnsi="Arial" w:eastAsia="Arial"/>
+                <w:b w:val="0"/>
+                <w:i w:val="0"/>
+                <w:sz w:val="17"/>
+              </w:rPr>
+              <w:t>8</w:t>
+            </w:r>
+          </w:p>
+        </w:tc>
+        <w:tc>
+          <w:tcPr>
+            <w:tcW w:type="dxa" w:w="1152"/>
+            <w:vAlign w:val="center"/>
+          </w:tcPr>
+          <w:p>
+            <w:pPr>
+              <w:spacing w:after="0"/>
+            </w:pPr>
+            <w:r/>
+            <w:r>
+              <w:rPr>
+                <w:rFonts w:ascii="Arial" w:hAnsi="Arial" w:eastAsia="Arial"/>
+                <w:b w:val="0"/>
+                <w:i w:val="0"/>
+                <w:sz w:val="17"/>
+              </w:rPr>
+              <w:t>Oct 2026</w:t>
+            </w:r>
+          </w:p>
+        </w:tc>
+        <w:tc>
+          <w:tcPr>
+            <w:tcW w:type="dxa" w:w="1008"/>
+            <w:vAlign w:val="center"/>
+          </w:tcPr>
+          <w:p>
+            <w:pPr>
+              <w:spacing w:after="0"/>
+            </w:pPr>
+            <w:r/>
+            <w:r>
+              <w:rPr>
+                <w:rFonts w:ascii="Arial" w:hAnsi="Arial" w:eastAsia="Arial"/>
+                <w:b w:val="0"/>
+                <w:i w:val="0"/>
+                <w:sz w:val="17"/>
+              </w:rPr>
+              <w:t>Oral</w:t>
+            </w:r>
+          </w:p>
+        </w:tc>
+        <w:tc>
+          <w:tcPr>
+            <w:tcW w:type="dxa" w:w="4464"/>
+            <w:vAlign w:val="center"/>
+          </w:tcPr>
+          <w:p>
+            <w:pPr>
+              <w:spacing w:after="0"/>
+            </w:pPr>
+            <w:r/>
+            <w:r>
+              <w:rPr>
+                <w:rFonts w:ascii="Arial" w:hAnsi="Arial" w:eastAsia="Arial"/>
+                <w:b w:val="0"/>
+                <w:i w:val="0"/>
+                <w:sz w:val="17"/>
+              </w:rPr>
+              <w:t>The Mayo Obesity Staging Index (MOSI): A Novel Staging Framework for Metabolic Surgery</w:t>
+            </w:r>
+          </w:p>
+        </w:tc>
+        <w:tc>
+          <w:tcPr>
+            <w:tcW w:type="dxa" w:w="2880"/>
+            <w:vAlign w:val="center"/>
+          </w:tcPr>
+          <w:p>
+            <w:pPr>
+              <w:spacing w:after="0"/>
+            </w:pPr>
+            <w:r/>
+            <w:r>
+              <w:rPr>
+                <w:rFonts w:ascii="Arial" w:hAnsi="Arial" w:eastAsia="Arial"/>
+                <w:b w:val="0"/>
+                <w:i w:val="0"/>
+                <w:sz w:val="17"/>
+              </w:rPr>
+              <w:t>Minnesota Surgical Society Annual Meeting 2026; United States (presented by Abdulrahman Alomar, DO)</w:t>
+            </w:r>
+          </w:p>
+        </w:tc>
+      </w:tr>
+      <w:tr>
+        <w:tc>
+          <w:tcPr>
+            <w:tcW w:type="dxa" w:w="504"/>
+            <w:vAlign w:val="center"/>
+          </w:tcPr>
+          <w:p>
+            <w:pPr>
+              <w:spacing w:after="0"/>
+            </w:pPr>
+            <w:r/>
+            <w:r>
+              <w:rPr>
+                <w:rFonts w:ascii="Arial" w:hAnsi="Arial" w:eastAsia="Arial"/>
+                <w:b w:val="0"/>
+                <w:i w:val="0"/>
+                <w:sz w:val="17"/>
+              </w:rPr>
+              <w:t>9</w:t>
+            </w:r>
+          </w:p>
+        </w:tc>
+        <w:tc>
+          <w:tcPr>
+            <w:tcW w:type="dxa" w:w="1152"/>
+            <w:vAlign w:val="center"/>
+          </w:tcPr>
+          <w:p>
+            <w:pPr>
+              <w:spacing w:after="0"/>
+            </w:pPr>
+            <w:r/>
+            <w:r>
+              <w:rPr>
+                <w:rFonts w:ascii="Arial" w:hAnsi="Arial" w:eastAsia="Arial"/>
+                <w:b w:val="0"/>
+                <w:i w:val="0"/>
+                <w:sz w:val="17"/>
+              </w:rPr>
               <w:t>Sep 2026</w:t>
             </w:r>
           </w:p>
@@ -20370,7 +20584,7 @@
                 <w:i w:val="0"/>
                 <w:sz w:val="17"/>
               </w:rPr>
-              <w:t>8</w:t>
+              <w:t>10</w:t>
             </w:r>
           </w:p>
         </w:tc>
@@ -20477,7 +20691,7 @@
                 <w:i w:val="0"/>
                 <w:sz w:val="17"/>
               </w:rPr>
-              <w:t>9</w:t>
+              <w:t>11</w:t>
             </w:r>
           </w:p>
         </w:tc>
@@ -20584,7 +20798,7 @@
                 <w:i w:val="0"/>
                 <w:sz w:val="17"/>
               </w:rPr>
-              <w:t>10</w:t>
+              <w:t>12</w:t>
             </w:r>
           </w:p>
         </w:tc>
@@ -20691,7 +20905,7 @@
                 <w:i w:val="0"/>
                 <w:sz w:val="17"/>
               </w:rPr>
-              <w:t>11</w:t>
+              <w:t>13</w:t>
             </w:r>
           </w:p>
         </w:tc>
@@ -20798,7 +21012,7 @@
                 <w:i w:val="0"/>
                 <w:sz w:val="17"/>
               </w:rPr>
-              <w:t>12</w:t>
+              <w:t>14</w:t>
             </w:r>
           </w:p>
         </w:tc>
@@ -20905,7 +21119,7 @@
                 <w:i w:val="0"/>
                 <w:sz w:val="17"/>
               </w:rPr>
-              <w:t>13</w:t>
+              <w:t>15</w:t>
             </w:r>
           </w:p>
         </w:tc>
@@ -21012,7 +21226,7 @@
                 <w:i w:val="0"/>
                 <w:sz w:val="17"/>
               </w:rPr>
-              <w:t>14</w:t>
+              <w:t>16</w:t>
             </w:r>
           </w:p>
         </w:tc>
@@ -21097,220 +21311,6 @@
                 <w:sz w:val="17"/>
               </w:rPr>
               <w:t>Society of Surgical Oncology (SSO); United States</w:t>
-            </w:r>
-          </w:p>
-        </w:tc>
-      </w:tr>
-      <w:tr>
-        <w:tc>
-          <w:tcPr>
-            <w:tcW w:type="dxa" w:w="504"/>
-            <w:vAlign w:val="center"/>
-          </w:tcPr>
-          <w:p>
-            <w:pPr>
-              <w:spacing w:after="0"/>
-            </w:pPr>
-            <w:r/>
-            <w:r>
-              <w:rPr>
-                <w:rFonts w:ascii="Arial" w:hAnsi="Arial" w:eastAsia="Arial"/>
-                <w:b w:val="0"/>
-                <w:i w:val="0"/>
-                <w:sz w:val="17"/>
-              </w:rPr>
-              <w:t>15</w:t>
-            </w:r>
-          </w:p>
-        </w:tc>
-        <w:tc>
-          <w:tcPr>
-            <w:tcW w:type="dxa" w:w="1152"/>
-            <w:vAlign w:val="center"/>
-          </w:tcPr>
-          <w:p>
-            <w:pPr>
-              <w:spacing w:after="0"/>
-            </w:pPr>
-            <w:r/>
-            <w:r>
-              <w:rPr>
-                <w:rFonts w:ascii="Arial" w:hAnsi="Arial" w:eastAsia="Arial"/>
-                <w:b w:val="0"/>
-                <w:i w:val="0"/>
-                <w:sz w:val="17"/>
-              </w:rPr>
-              <w:t>2026</w:t>
-            </w:r>
-          </w:p>
-        </w:tc>
-        <w:tc>
-          <w:tcPr>
-            <w:tcW w:type="dxa" w:w="1008"/>
-            <w:vAlign w:val="center"/>
-          </w:tcPr>
-          <w:p>
-            <w:pPr>
-              <w:spacing w:after="0"/>
-            </w:pPr>
-            <w:r/>
-            <w:r>
-              <w:rPr>
-                <w:rFonts w:ascii="Arial" w:hAnsi="Arial" w:eastAsia="Arial"/>
-                <w:b w:val="0"/>
-                <w:i w:val="0"/>
-                <w:sz w:val="17"/>
-              </w:rPr>
-              <w:t>Oral</w:t>
-            </w:r>
-          </w:p>
-        </w:tc>
-        <w:tc>
-          <w:tcPr>
-            <w:tcW w:type="dxa" w:w="4464"/>
-            <w:vAlign w:val="center"/>
-          </w:tcPr>
-          <w:p>
-            <w:pPr>
-              <w:spacing w:after="0"/>
-            </w:pPr>
-            <w:r/>
-            <w:r>
-              <w:rPr>
-                <w:rFonts w:ascii="Arial" w:hAnsi="Arial" w:eastAsia="Arial"/>
-                <w:b w:val="0"/>
-                <w:i w:val="0"/>
-                <w:sz w:val="17"/>
-              </w:rPr>
-              <w:t>Area Deprivation Index, Social Determinants of Health, and Weight-Loss Outcomes After Bariatric Surgery: A Retrospective Referral-Center Cohort Study</w:t>
-            </w:r>
-          </w:p>
-        </w:tc>
-        <w:tc>
-          <w:tcPr>
-            <w:tcW w:type="dxa" w:w="2880"/>
-            <w:vAlign w:val="center"/>
-          </w:tcPr>
-          <w:p>
-            <w:pPr>
-              <w:spacing w:after="0"/>
-            </w:pPr>
-            <w:r/>
-            <w:r>
-              <w:rPr>
-                <w:rFonts w:ascii="Arial" w:hAnsi="Arial" w:eastAsia="Arial"/>
-                <w:b w:val="0"/>
-                <w:i w:val="0"/>
-                <w:sz w:val="17"/>
-              </w:rPr>
-              <w:t>Minnesota Surgical Society Annual Meeting 2026; United States</w:t>
-            </w:r>
-          </w:p>
-        </w:tc>
-      </w:tr>
-      <w:tr>
-        <w:tc>
-          <w:tcPr>
-            <w:tcW w:type="dxa" w:w="504"/>
-            <w:vAlign w:val="center"/>
-          </w:tcPr>
-          <w:p>
-            <w:pPr>
-              <w:spacing w:after="0"/>
-            </w:pPr>
-            <w:r/>
-            <w:r>
-              <w:rPr>
-                <w:rFonts w:ascii="Arial" w:hAnsi="Arial" w:eastAsia="Arial"/>
-                <w:b w:val="0"/>
-                <w:i w:val="0"/>
-                <w:sz w:val="17"/>
-              </w:rPr>
-              <w:t>16</w:t>
-            </w:r>
-          </w:p>
-        </w:tc>
-        <w:tc>
-          <w:tcPr>
-            <w:tcW w:type="dxa" w:w="1152"/>
-            <w:vAlign w:val="center"/>
-          </w:tcPr>
-          <w:p>
-            <w:pPr>
-              <w:spacing w:after="0"/>
-            </w:pPr>
-            <w:r/>
-            <w:r>
-              <w:rPr>
-                <w:rFonts w:ascii="Arial" w:hAnsi="Arial" w:eastAsia="Arial"/>
-                <w:b w:val="0"/>
-                <w:i w:val="0"/>
-                <w:sz w:val="17"/>
-              </w:rPr>
-              <w:t>2026</w:t>
-            </w:r>
-          </w:p>
-        </w:tc>
-        <w:tc>
-          <w:tcPr>
-            <w:tcW w:type="dxa" w:w="1008"/>
-            <w:vAlign w:val="center"/>
-          </w:tcPr>
-          <w:p>
-            <w:pPr>
-              <w:spacing w:after="0"/>
-            </w:pPr>
-            <w:r/>
-            <w:r>
-              <w:rPr>
-                <w:rFonts w:ascii="Arial" w:hAnsi="Arial" w:eastAsia="Arial"/>
-                <w:b w:val="0"/>
-                <w:i w:val="0"/>
-                <w:sz w:val="17"/>
-              </w:rPr>
-              <w:t>Oral</w:t>
-            </w:r>
-          </w:p>
-        </w:tc>
-        <w:tc>
-          <w:tcPr>
-            <w:tcW w:type="dxa" w:w="4464"/>
-            <w:vAlign w:val="center"/>
-          </w:tcPr>
-          <w:p>
-            <w:pPr>
-              <w:spacing w:after="0"/>
-            </w:pPr>
-            <w:r/>
-            <w:r>
-              <w:rPr>
-                <w:rFonts w:ascii="Arial" w:hAnsi="Arial" w:eastAsia="Arial"/>
-                <w:b w:val="0"/>
-                <w:i w:val="0"/>
-                <w:sz w:val="17"/>
-              </w:rPr>
-              <w:t>The Mayo Obesity Staging Index (MOSI): A Novel Staging Framework for Metabolic Surgery</w:t>
-            </w:r>
-          </w:p>
-        </w:tc>
-        <w:tc>
-          <w:tcPr>
-            <w:tcW w:type="dxa" w:w="2880"/>
-            <w:vAlign w:val="center"/>
-          </w:tcPr>
-          <w:p>
-            <w:pPr>
-              <w:spacing w:after="0"/>
-            </w:pPr>
-            <w:r/>
-            <w:r>
-              <w:rPr>
-                <w:rFonts w:ascii="Arial" w:hAnsi="Arial" w:eastAsia="Arial"/>
-                <w:b w:val="0"/>
-                <w:i w:val="0"/>
-                <w:sz w:val="17"/>
-              </w:rPr>
-              <w:t>Minnesota Surgical Society Annual Meeting 2026; United States (presented by Abdulrahman Alomar, DO)</w:t>
             </w:r>
           </w:p>
         </w:tc>

</xml_diff>

<commit_message>
Add two ASPN 2027 poster presentations
Add the Nerve- and Tendon-Based Procedures (spastic calcaneal,
planovalgus, and striatal toe deformities) anatomic study and the
Sciatic Nerve Procedures for the spastic knee anatomic study and case
report, both posters at the American Society for Peripheral Nerve
(ASPN) Annual Meeting 2027.

Both use the same Jan 2027 date, venue, and conference as the existing
ASPN femoral nerve oral presentation, so all three now lead the
presentations list.

The PDF is left for CI to rebuild with LibreOffice rather than
committing the sandbox WeasyPrint fallback.

Co-Authored-By: Claude Opus 5 <noreply@anthropic.com>
Claude-Session: https://claude.ai/code/session_01Mvoqy98ifTezCDCHR5sSsp
</commit_message>
<xml_diff>
--- a/Shahriarirad_Reza_CV.docx
+++ b/Shahriarirad_Reza_CV.docx
@@ -651,7 +651,7 @@
                 <w:i w:val="0"/>
                 <w:sz w:val="17"/>
               </w:rPr>
-              <w:t>September 15, 2026</w:t>
+              <w:t>September 17, 2026</w:t>
             </w:r>
           </w:p>
         </w:tc>
@@ -3355,7 +3355,7 @@
                 <w:i w:val="0"/>
                 <w:sz w:val="17"/>
               </w:rPr>
-              <w:t>31</w:t>
+              <w:t>33</w:t>
             </w:r>
           </w:p>
         </w:tc>
@@ -3399,7 +3399,7 @@
                 <w:i w:val="0"/>
                 <w:sz w:val="17"/>
               </w:rPr>
-              <w:t>25</w:t>
+              <w:t>27</w:t>
             </w:r>
           </w:p>
         </w:tc>
@@ -19749,6 +19749,220 @@
                 <w:i w:val="0"/>
                 <w:sz w:val="17"/>
               </w:rPr>
+              <w:t>Jan 2027</w:t>
+            </w:r>
+          </w:p>
+        </w:tc>
+        <w:tc>
+          <w:tcPr>
+            <w:tcW w:type="dxa" w:w="1008"/>
+            <w:vAlign w:val="center"/>
+          </w:tcPr>
+          <w:p>
+            <w:pPr>
+              <w:spacing w:after="0"/>
+            </w:pPr>
+            <w:r/>
+            <w:r>
+              <w:rPr>
+                <w:rFonts w:ascii="Arial" w:hAnsi="Arial" w:eastAsia="Arial"/>
+                <w:b w:val="0"/>
+                <w:i w:val="0"/>
+                <w:sz w:val="17"/>
+              </w:rPr>
+              <w:t>Poster</w:t>
+            </w:r>
+          </w:p>
+        </w:tc>
+        <w:tc>
+          <w:tcPr>
+            <w:tcW w:type="dxa" w:w="4464"/>
+            <w:vAlign w:val="center"/>
+          </w:tcPr>
+          <w:p>
+            <w:pPr>
+              <w:spacing w:after="0"/>
+            </w:pPr>
+            <w:r/>
+            <w:r>
+              <w:rPr>
+                <w:rFonts w:ascii="Arial" w:hAnsi="Arial" w:eastAsia="Arial"/>
+                <w:b w:val="0"/>
+                <w:i w:val="0"/>
+                <w:sz w:val="17"/>
+              </w:rPr>
+              <w:t>Nerve- and Tendon-Based Procedures for Spastic Calcaneal, Planovalgus, and Striatal Toe Deformities: An Anatomic Study</w:t>
+            </w:r>
+          </w:p>
+        </w:tc>
+        <w:tc>
+          <w:tcPr>
+            <w:tcW w:type="dxa" w:w="2880"/>
+            <w:vAlign w:val="center"/>
+          </w:tcPr>
+          <w:p>
+            <w:pPr>
+              <w:spacing w:after="0"/>
+            </w:pPr>
+            <w:r/>
+            <w:r>
+              <w:rPr>
+                <w:rFonts w:ascii="Arial" w:hAnsi="Arial" w:eastAsia="Arial"/>
+                <w:b w:val="0"/>
+                <w:i w:val="0"/>
+                <w:sz w:val="17"/>
+              </w:rPr>
+              <w:t>American Society for Peripheral Nerve (ASPN) Annual Meeting; United States</w:t>
+            </w:r>
+          </w:p>
+        </w:tc>
+      </w:tr>
+      <w:tr>
+        <w:tc>
+          <w:tcPr>
+            <w:tcW w:type="dxa" w:w="504"/>
+            <w:vAlign w:val="center"/>
+          </w:tcPr>
+          <w:p>
+            <w:pPr>
+              <w:spacing w:after="0"/>
+            </w:pPr>
+            <w:r/>
+            <w:r>
+              <w:rPr>
+                <w:rFonts w:ascii="Arial" w:hAnsi="Arial" w:eastAsia="Arial"/>
+                <w:b w:val="0"/>
+                <w:i w:val="0"/>
+                <w:sz w:val="17"/>
+              </w:rPr>
+              <w:t>3</w:t>
+            </w:r>
+          </w:p>
+        </w:tc>
+        <w:tc>
+          <w:tcPr>
+            <w:tcW w:type="dxa" w:w="1152"/>
+            <w:vAlign w:val="center"/>
+          </w:tcPr>
+          <w:p>
+            <w:pPr>
+              <w:spacing w:after="0"/>
+            </w:pPr>
+            <w:r/>
+            <w:r>
+              <w:rPr>
+                <w:rFonts w:ascii="Arial" w:hAnsi="Arial" w:eastAsia="Arial"/>
+                <w:b w:val="0"/>
+                <w:i w:val="0"/>
+                <w:sz w:val="17"/>
+              </w:rPr>
+              <w:t>Jan 2027</w:t>
+            </w:r>
+          </w:p>
+        </w:tc>
+        <w:tc>
+          <w:tcPr>
+            <w:tcW w:type="dxa" w:w="1008"/>
+            <w:vAlign w:val="center"/>
+          </w:tcPr>
+          <w:p>
+            <w:pPr>
+              <w:spacing w:after="0"/>
+            </w:pPr>
+            <w:r/>
+            <w:r>
+              <w:rPr>
+                <w:rFonts w:ascii="Arial" w:hAnsi="Arial" w:eastAsia="Arial"/>
+                <w:b w:val="0"/>
+                <w:i w:val="0"/>
+                <w:sz w:val="17"/>
+              </w:rPr>
+              <w:t>Poster</w:t>
+            </w:r>
+          </w:p>
+        </w:tc>
+        <w:tc>
+          <w:tcPr>
+            <w:tcW w:type="dxa" w:w="4464"/>
+            <w:vAlign w:val="center"/>
+          </w:tcPr>
+          <w:p>
+            <w:pPr>
+              <w:spacing w:after="0"/>
+            </w:pPr>
+            <w:r/>
+            <w:r>
+              <w:rPr>
+                <w:rFonts w:ascii="Arial" w:hAnsi="Arial" w:eastAsia="Arial"/>
+                <w:b w:val="0"/>
+                <w:i w:val="0"/>
+                <w:sz w:val="17"/>
+              </w:rPr>
+              <w:t>Sciatic Nerve Procedures for the Spastic Knee in Ambulatory Patients: An Anatomic Study and Case Report</w:t>
+            </w:r>
+          </w:p>
+        </w:tc>
+        <w:tc>
+          <w:tcPr>
+            <w:tcW w:type="dxa" w:w="2880"/>
+            <w:vAlign w:val="center"/>
+          </w:tcPr>
+          <w:p>
+            <w:pPr>
+              <w:spacing w:after="0"/>
+            </w:pPr>
+            <w:r/>
+            <w:r>
+              <w:rPr>
+                <w:rFonts w:ascii="Arial" w:hAnsi="Arial" w:eastAsia="Arial"/>
+                <w:b w:val="0"/>
+                <w:i w:val="0"/>
+                <w:sz w:val="17"/>
+              </w:rPr>
+              <w:t>American Society for Peripheral Nerve (ASPN) Annual Meeting; United States</w:t>
+            </w:r>
+          </w:p>
+        </w:tc>
+      </w:tr>
+      <w:tr>
+        <w:tc>
+          <w:tcPr>
+            <w:tcW w:type="dxa" w:w="504"/>
+            <w:vAlign w:val="center"/>
+          </w:tcPr>
+          <w:p>
+            <w:pPr>
+              <w:spacing w:after="0"/>
+            </w:pPr>
+            <w:r/>
+            <w:r>
+              <w:rPr>
+                <w:rFonts w:ascii="Arial" w:hAnsi="Arial" w:eastAsia="Arial"/>
+                <w:b w:val="0"/>
+                <w:i w:val="0"/>
+                <w:sz w:val="17"/>
+              </w:rPr>
+              <w:t>4</w:t>
+            </w:r>
+          </w:p>
+        </w:tc>
+        <w:tc>
+          <w:tcPr>
+            <w:tcW w:type="dxa" w:w="1152"/>
+            <w:vAlign w:val="center"/>
+          </w:tcPr>
+          <w:p>
+            <w:pPr>
+              <w:spacing w:after="0"/>
+            </w:pPr>
+            <w:r/>
+            <w:r>
+              <w:rPr>
+                <w:rFonts w:ascii="Arial" w:hAnsi="Arial" w:eastAsia="Arial"/>
+                <w:b w:val="0"/>
+                <w:i w:val="0"/>
+                <w:sz w:val="17"/>
+              </w:rPr>
               <w:t>Oct 2026</w:t>
             </w:r>
           </w:p>
@@ -19835,7 +20049,7 @@
                 <w:i w:val="0"/>
                 <w:sz w:val="17"/>
               </w:rPr>
-              <w:t>3</w:t>
+              <w:t>5</w:t>
             </w:r>
           </w:p>
         </w:tc>
@@ -19942,7 +20156,7 @@
                 <w:i w:val="0"/>
                 <w:sz w:val="17"/>
               </w:rPr>
-              <w:t>4</w:t>
+              <w:t>6</w:t>
             </w:r>
           </w:p>
         </w:tc>
@@ -20049,7 +20263,7 @@
                 <w:i w:val="0"/>
                 <w:sz w:val="17"/>
               </w:rPr>
-              <w:t>5</w:t>
+              <w:t>7</w:t>
             </w:r>
           </w:p>
         </w:tc>
@@ -20156,7 +20370,7 @@
                 <w:i w:val="0"/>
                 <w:sz w:val="17"/>
               </w:rPr>
-              <w:t>6</w:t>
+              <w:t>8</w:t>
             </w:r>
           </w:p>
         </w:tc>
@@ -20263,7 +20477,7 @@
                 <w:i w:val="0"/>
                 <w:sz w:val="17"/>
               </w:rPr>
-              <w:t>7</w:t>
+              <w:t>9</w:t>
             </w:r>
           </w:p>
         </w:tc>
@@ -20370,7 +20584,7 @@
                 <w:i w:val="0"/>
                 <w:sz w:val="17"/>
               </w:rPr>
-              <w:t>8</w:t>
+              <w:t>10</w:t>
             </w:r>
           </w:p>
         </w:tc>
@@ -20477,7 +20691,7 @@
                 <w:i w:val="0"/>
                 <w:sz w:val="17"/>
               </w:rPr>
-              <w:t>9</w:t>
+              <w:t>11</w:t>
             </w:r>
           </w:p>
         </w:tc>
@@ -20584,7 +20798,7 @@
                 <w:i w:val="0"/>
                 <w:sz w:val="17"/>
               </w:rPr>
-              <w:t>10</w:t>
+              <w:t>12</w:t>
             </w:r>
           </w:p>
         </w:tc>
@@ -20691,7 +20905,7 @@
                 <w:i w:val="0"/>
                 <w:sz w:val="17"/>
               </w:rPr>
-              <w:t>11</w:t>
+              <w:t>13</w:t>
             </w:r>
           </w:p>
         </w:tc>
@@ -20798,7 +21012,7 @@
                 <w:i w:val="0"/>
                 <w:sz w:val="17"/>
               </w:rPr>
-              <w:t>12</w:t>
+              <w:t>14</w:t>
             </w:r>
           </w:p>
         </w:tc>
@@ -20905,7 +21119,7 @@
                 <w:i w:val="0"/>
                 <w:sz w:val="17"/>
               </w:rPr>
-              <w:t>13</w:t>
+              <w:t>15</w:t>
             </w:r>
           </w:p>
         </w:tc>
@@ -21012,7 +21226,7 @@
                 <w:i w:val="0"/>
                 <w:sz w:val="17"/>
               </w:rPr>
-              <w:t>14</w:t>
+              <w:t>16</w:t>
             </w:r>
           </w:p>
         </w:tc>
@@ -21119,7 +21333,7 @@
                 <w:i w:val="0"/>
                 <w:sz w:val="17"/>
               </w:rPr>
-              <w:t>15</w:t>
+              <w:t>17</w:t>
             </w:r>
           </w:p>
         </w:tc>
@@ -21226,7 +21440,7 @@
                 <w:i w:val="0"/>
                 <w:sz w:val="17"/>
               </w:rPr>
-              <w:t>16</w:t>
+              <w:t>18</w:t>
             </w:r>
           </w:p>
         </w:tc>
@@ -21333,7 +21547,7 @@
                 <w:i w:val="0"/>
                 <w:sz w:val="17"/>
               </w:rPr>
-              <w:t>17</w:t>
+              <w:t>19</w:t>
             </w:r>
           </w:p>
         </w:tc>
@@ -21440,7 +21654,7 @@
                 <w:i w:val="0"/>
                 <w:sz w:val="17"/>
               </w:rPr>
-              <w:t>18</w:t>
+              <w:t>20</w:t>
             </w:r>
           </w:p>
         </w:tc>
@@ -21547,7 +21761,7 @@
                 <w:i w:val="0"/>
                 <w:sz w:val="17"/>
               </w:rPr>
-              <w:t>19</w:t>
+              <w:t>21</w:t>
             </w:r>
           </w:p>
         </w:tc>
@@ -21654,7 +21868,7 @@
                 <w:i w:val="0"/>
                 <w:sz w:val="17"/>
               </w:rPr>
-              <w:t>20</w:t>
+              <w:t>22</w:t>
             </w:r>
           </w:p>
         </w:tc>
@@ -21761,7 +21975,7 @@
                 <w:i w:val="0"/>
                 <w:sz w:val="17"/>
               </w:rPr>
-              <w:t>21</w:t>
+              <w:t>23</w:t>
             </w:r>
           </w:p>
         </w:tc>
@@ -21868,7 +22082,7 @@
                 <w:i w:val="0"/>
                 <w:sz w:val="17"/>
               </w:rPr>
-              <w:t>22</w:t>
+              <w:t>24</w:t>
             </w:r>
           </w:p>
         </w:tc>
@@ -21975,7 +22189,7 @@
                 <w:i w:val="0"/>
                 <w:sz w:val="17"/>
               </w:rPr>
-              <w:t>23</w:t>
+              <w:t>25</w:t>
             </w:r>
           </w:p>
         </w:tc>
@@ -22082,7 +22296,7 @@
                 <w:i w:val="0"/>
                 <w:sz w:val="17"/>
               </w:rPr>
-              <w:t>24</w:t>
+              <w:t>26</w:t>
             </w:r>
           </w:p>
         </w:tc>
@@ -22189,7 +22403,7 @@
                 <w:i w:val="0"/>
                 <w:sz w:val="17"/>
               </w:rPr>
-              <w:t>25</w:t>
+              <w:t>27</w:t>
             </w:r>
           </w:p>
         </w:tc>
@@ -22296,7 +22510,7 @@
                 <w:i w:val="0"/>
                 <w:sz w:val="17"/>
               </w:rPr>
-              <w:t>26</w:t>
+              <w:t>28</w:t>
             </w:r>
           </w:p>
         </w:tc>
@@ -22403,7 +22617,7 @@
                 <w:i w:val="0"/>
                 <w:sz w:val="17"/>
               </w:rPr>
-              <w:t>27</w:t>
+              <w:t>29</w:t>
             </w:r>
           </w:p>
         </w:tc>
@@ -22510,7 +22724,7 @@
                 <w:i w:val="0"/>
                 <w:sz w:val="17"/>
               </w:rPr>
-              <w:t>28</w:t>
+              <w:t>30</w:t>
             </w:r>
           </w:p>
         </w:tc>
@@ -22617,7 +22831,7 @@
                 <w:i w:val="0"/>
                 <w:sz w:val="17"/>
               </w:rPr>
-              <w:t>29</w:t>
+              <w:t>31</w:t>
             </w:r>
           </w:p>
         </w:tc>
@@ -22724,7 +22938,7 @@
                 <w:i w:val="0"/>
                 <w:sz w:val="17"/>
               </w:rPr>
-              <w:t>30</w:t>
+              <w:t>32</w:t>
             </w:r>
           </w:p>
         </w:tc>
@@ -22831,7 +23045,7 @@
                 <w:i w:val="0"/>
                 <w:sz w:val="17"/>
               </w:rPr>
-              <w:t>31</w:t>
+              <w:t>33</w:t>
             </w:r>
           </w:p>
         </w:tc>

</xml_diff>

<commit_message>
Add ACS Clinical Congress 2026 teaching assistant role to Leadership
Add a Sep 2026 Leadership entry for serving as a teaching assistant in
the computer vision session of the ACS Clinical Congress 2026 hands-on
course 'AI Skills: What Can I Do Now and What's Coming in the Future?'
in Washington, DC, as part of the A-Star Lab faculty team with faculty
from Moonshot AI and Stanford University.

The entry sits first, since Leadership renders in file order and this
is the most recent role.

The PDF is left for CI to rebuild with LibreOffice rather than
committing the sandbox WeasyPrint fallback.

Co-Authored-By: Claude Opus 5.5 <noreply@anthropic.com>
Claude-Session: https://claude.ai/code/session_01Mvoqy98ifTezCDCHR5sSsp
</commit_message>
<xml_diff>
--- a/Shahriarirad_Reza_CV.docx
+++ b/Shahriarirad_Reza_CV.docx
@@ -651,7 +651,7 @@
                 <w:i w:val="0"/>
                 <w:sz w:val="17"/>
               </w:rPr>
-              <w:t>October 05, 2026</w:t>
+              <w:t>October 06, 2026</w:t>
             </w:r>
           </w:p>
         </w:tc>
@@ -2122,6 +2122,92 @@
                 <w:sz w:val="17"/>
               </w:rPr>
               <w:t>Description</w:t>
+            </w:r>
+          </w:p>
+        </w:tc>
+      </w:tr>
+      <w:tr>
+        <w:tc>
+          <w:tcPr>
+            <w:tcW w:type="dxa" w:w="2592"/>
+            <w:vAlign w:val="center"/>
+          </w:tcPr>
+          <w:p>
+            <w:pPr>
+              <w:spacing w:after="0"/>
+            </w:pPr>
+            <w:r/>
+            <w:r>
+              <w:rPr>
+                <w:rFonts w:ascii="Arial" w:hAnsi="Arial" w:eastAsia="Arial"/>
+                <w:b w:val="0"/>
+                <w:i w:val="0"/>
+                <w:sz w:val="17"/>
+              </w:rPr>
+              <w:t>Sep 2026</w:t>
+            </w:r>
+          </w:p>
+        </w:tc>
+        <w:tc>
+          <w:tcPr>
+            <w:tcW w:type="dxa" w:w="2592"/>
+            <w:vAlign w:val="center"/>
+          </w:tcPr>
+          <w:p>
+            <w:pPr>
+              <w:spacing w:after="0"/>
+            </w:pPr>
+            <w:r/>
+            <w:r>
+              <w:rPr>
+                <w:rFonts w:ascii="Arial" w:hAnsi="Arial" w:eastAsia="Arial"/>
+                <w:b w:val="0"/>
+                <w:i w:val="0"/>
+                <w:sz w:val="17"/>
+              </w:rPr>
+              <w:t>Teaching Assistant – ACS Clinical Congress 2026 Hands-On AI Course (Computer Vision Session)</w:t>
+            </w:r>
+          </w:p>
+        </w:tc>
+        <w:tc>
+          <w:tcPr>
+            <w:tcW w:type="dxa" w:w="2592"/>
+            <w:vAlign w:val="center"/>
+          </w:tcPr>
+          <w:p>
+            <w:pPr>
+              <w:spacing w:after="0"/>
+            </w:pPr>
+            <w:r/>
+            <w:r>
+              <w:rPr>
+                <w:rFonts w:ascii="Arial" w:hAnsi="Arial" w:eastAsia="Arial"/>
+                <w:b w:val="0"/>
+                <w:i w:val="0"/>
+                <w:sz w:val="17"/>
+              </w:rPr>
+              <w:t>American College of Surgeons Clinical Congress 2026, Washington, DC</w:t>
+            </w:r>
+          </w:p>
+        </w:tc>
+        <w:tc>
+          <w:tcPr>
+            <w:tcW w:type="dxa" w:w="2592"/>
+            <w:vAlign w:val="center"/>
+          </w:tcPr>
+          <w:p>
+            <w:pPr>
+              <w:spacing w:after="0"/>
+            </w:pPr>
+            <w:r/>
+            <w:r>
+              <w:rPr>
+                <w:rFonts w:ascii="Arial" w:hAnsi="Arial" w:eastAsia="Arial"/>
+                <w:b w:val="0"/>
+                <w:i w:val="0"/>
+                <w:sz w:val="17"/>
+              </w:rPr>
+              <w:t>Taught in the computer vision session of the ACS hands-on course “AI Skills: What Can I Do Now and What's Coming in the Future?” as part of the A-Star Lab faculty team, alongside faculty from Moonshot AI and Stanford University. Guided surgeons and clinicians as they annotated laparoscopic cholecystectomy frames in teams, labeling anatomy and instruments, then trained models on their own labels and compared the results side by side to see how annotation quality shapes what AI learns to see.</w:t>
             </w:r>
           </w:p>
         </w:tc>

</xml_diff>

<commit_message>
Tag 13 senior-author papers and raise the senior-author count to 51
PubMed lists Dr. Shahriarirad as the last author on 13 papers that
carried no 'last' tag (#3, 4, 7, 12, 15, 17, 20, 23, 24, 31, 37, 41, 54;
most already tagged corresponding). He confirmed all 13 count as senior
authorship, so tag them and update profile.csv last_auth from 38 to 51.
The validator's tag-vs-profile cross-check passes at the new count.

Regenerated the site, JSON, Word CV and PDF (both print the count), and
the compact resume's impact line.

Co-Authored-By: Claude Opus 5.5 <noreply@anthropic.com>
Claude-Session: https://claude.ai/code/session_01Mvoqy98ifTezCDCHR5sSsp
</commit_message>
<xml_diff>
--- a/Shahriarirad_Reza_CV.docx
+++ b/Shahriarirad_Reza_CV.docx
@@ -307,7 +307,7 @@
                 <w:i w:val="0"/>
                 <w:sz w:val="17"/>
               </w:rPr>
-              <w:t>38</w:t>
+              <w:t>51</w:t>
             </w:r>
           </w:p>
         </w:tc>
@@ -651,7 +651,7 @@
                 <w:i w:val="0"/>
                 <w:sz w:val="17"/>
               </w:rPr>
-              <w:t>October 19, 2026</w:t>
+              <w:t>October 27, 2026</w:t>
             </w:r>
           </w:p>
         </w:tc>

</xml_diff>

<commit_message>
Correct authorship tags for #18, #160, #168 and #195
Dr. Shahriarirad confirmed none of the four was shared first or senior
authorship, and that he is corresponding author on #18, #160 and #168:

- #18  first;corresponding -> corresponding (PubMed: 2nd of 13)
- #160 last -> corresponding (4th of 6)
- #168 corresponding;last -> corresponding (4th of 6)
- #195 last -> no tag (3rd of 4)

profile.csv counts follow the tags: first author 21 -> 20, senior
author 51 -> 48, corresponding 68 -> 69. Regenerated the site, JSON,
Word CV and PDF, and the compact resume.

Co-Authored-By: Claude Opus 5.5 <noreply@anthropic.com>
Claude-Session: https://claude.ai/code/session_01Mvoqy98ifTezCDCHR5sSsp
</commit_message>
<xml_diff>
--- a/Shahriarirad_Reza_CV.docx
+++ b/Shahriarirad_Reza_CV.docx
@@ -219,7 +219,7 @@
                 <w:i w:val="0"/>
                 <w:sz w:val="17"/>
               </w:rPr>
-              <w:t>21</w:t>
+              <w:t>20</w:t>
             </w:r>
           </w:p>
         </w:tc>
@@ -307,7 +307,7 @@
                 <w:i w:val="0"/>
                 <w:sz w:val="17"/>
               </w:rPr>
-              <w:t>51</w:t>
+              <w:t>48</w:t>
             </w:r>
           </w:p>
         </w:tc>
@@ -351,7 +351,7 @@
                 <w:i w:val="0"/>
                 <w:sz w:val="17"/>
               </w:rPr>
-              <w:t>68</w:t>
+              <w:t>69</w:t>
             </w:r>
           </w:p>
         </w:tc>

</xml_diff>

<commit_message>
Add MRFA Team Collaboration Award, MSS best oral award, Nov date
- Minnesota Surgical Society Annual Meeting 2026 talks dated Nov 2026
- MOSI oral at that meeting labelled Best Oral Presentation Award
- Awards: Team Collaboration Award (Project Lead), Mayo Research
  Fellows' Association 2026, for the AI-ECG bariatric surgery project,
  linked to the A-Star Lab news post
- Leadership cards take an optional url column; the ACS Clinical
  Congress 2026 teaching-assistant card links to the A-Star Lab news post

Co-Authored-By: Claude Opus 5.5 <noreply@anthropic.com>
Claude-Session: https://claude.ai/code/session_01Mvoqy98ifTezCDCHR5sSsp
</commit_message>
<xml_diff>
--- a/Shahriarirad_Reza_CV.docx
+++ b/Shahriarirad_Reza_CV.docx
@@ -1860,6 +1860,71 @@
                 <w:sz w:val="17"/>
               </w:rPr>
               <w:t>Organization</w:t>
+            </w:r>
+          </w:p>
+        </w:tc>
+      </w:tr>
+      <w:tr>
+        <w:tc>
+          <w:tcPr>
+            <w:tcW w:type="dxa" w:w="3456"/>
+            <w:vAlign w:val="center"/>
+          </w:tcPr>
+          <w:p>
+            <w:pPr>
+              <w:spacing w:after="0"/>
+            </w:pPr>
+            <w:r/>
+            <w:r>
+              <w:rPr>
+                <w:rFonts w:ascii="Arial" w:hAnsi="Arial" w:eastAsia="Arial"/>
+                <w:b w:val="0"/>
+                <w:i w:val="0"/>
+                <w:sz w:val="17"/>
+              </w:rPr>
+              <w:t>2026</w:t>
+            </w:r>
+          </w:p>
+        </w:tc>
+        <w:tc>
+          <w:tcPr>
+            <w:tcW w:type="dxa" w:w="3456"/>
+            <w:vAlign w:val="center"/>
+          </w:tcPr>
+          <w:p>
+            <w:pPr>
+              <w:spacing w:after="0"/>
+            </w:pPr>
+            <w:r/>
+            <w:r>
+              <w:rPr>
+                <w:rFonts w:ascii="Arial" w:hAnsi="Arial" w:eastAsia="Arial"/>
+                <w:b w:val="0"/>
+                <w:i w:val="0"/>
+                <w:sz w:val="17"/>
+              </w:rPr>
+              <w:t>Team Collaboration Award (Project Lead)</w:t>
+            </w:r>
+          </w:p>
+        </w:tc>
+        <w:tc>
+          <w:tcPr>
+            <w:tcW w:type="dxa" w:w="3456"/>
+            <w:vAlign w:val="center"/>
+          </w:tcPr>
+          <w:p>
+            <w:pPr>
+              <w:spacing w:after="0"/>
+            </w:pPr>
+            <w:r/>
+            <w:r>
+              <w:rPr>
+                <w:rFonts w:ascii="Arial" w:hAnsi="Arial" w:eastAsia="Arial"/>
+                <w:b w:val="0"/>
+                <w:i w:val="0"/>
+                <w:sz w:val="17"/>
+              </w:rPr>
+              <w:t>Mayo Research Fellows' Association</w:t>
             </w:r>
           </w:p>
         </w:tc>
@@ -20049,6 +20114,220 @@
                 <w:i w:val="0"/>
                 <w:sz w:val="17"/>
               </w:rPr>
+              <w:t>Nov 2026</w:t>
+            </w:r>
+          </w:p>
+        </w:tc>
+        <w:tc>
+          <w:tcPr>
+            <w:tcW w:type="dxa" w:w="1008"/>
+            <w:vAlign w:val="center"/>
+          </w:tcPr>
+          <w:p>
+            <w:pPr>
+              <w:spacing w:after="0"/>
+            </w:pPr>
+            <w:r/>
+            <w:r>
+              <w:rPr>
+                <w:rFonts w:ascii="Arial" w:hAnsi="Arial" w:eastAsia="Arial"/>
+                <w:b w:val="0"/>
+                <w:i w:val="0"/>
+                <w:sz w:val="17"/>
+              </w:rPr>
+              <w:t>Oral</w:t>
+            </w:r>
+          </w:p>
+        </w:tc>
+        <w:tc>
+          <w:tcPr>
+            <w:tcW w:type="dxa" w:w="4464"/>
+            <w:vAlign w:val="center"/>
+          </w:tcPr>
+          <w:p>
+            <w:pPr>
+              <w:spacing w:after="0"/>
+            </w:pPr>
+            <w:r/>
+            <w:r>
+              <w:rPr>
+                <w:rFonts w:ascii="Arial" w:hAnsi="Arial" w:eastAsia="Arial"/>
+                <w:b w:val="0"/>
+                <w:i w:val="0"/>
+                <w:sz w:val="17"/>
+              </w:rPr>
+              <w:t>Area Deprivation Index, Social Determinants of Health, and Weight-Loss Outcomes After Bariatric Surgery: A Retrospective Referral-Center Cohort Study</w:t>
+            </w:r>
+          </w:p>
+        </w:tc>
+        <w:tc>
+          <w:tcPr>
+            <w:tcW w:type="dxa" w:w="2880"/>
+            <w:vAlign w:val="center"/>
+          </w:tcPr>
+          <w:p>
+            <w:pPr>
+              <w:spacing w:after="0"/>
+            </w:pPr>
+            <w:r/>
+            <w:r>
+              <w:rPr>
+                <w:rFonts w:ascii="Arial" w:hAnsi="Arial" w:eastAsia="Arial"/>
+                <w:b w:val="0"/>
+                <w:i w:val="0"/>
+                <w:sz w:val="17"/>
+              </w:rPr>
+              <w:t>Minnesota Surgical Society Annual Meeting 2026; United States</w:t>
+            </w:r>
+          </w:p>
+        </w:tc>
+      </w:tr>
+      <w:tr>
+        <w:tc>
+          <w:tcPr>
+            <w:tcW w:type="dxa" w:w="504"/>
+            <w:vAlign w:val="center"/>
+          </w:tcPr>
+          <w:p>
+            <w:pPr>
+              <w:spacing w:after="0"/>
+            </w:pPr>
+            <w:r/>
+            <w:r>
+              <w:rPr>
+                <w:rFonts w:ascii="Arial" w:hAnsi="Arial" w:eastAsia="Arial"/>
+                <w:b w:val="0"/>
+                <w:i w:val="0"/>
+                <w:sz w:val="17"/>
+              </w:rPr>
+              <w:t>5</w:t>
+            </w:r>
+          </w:p>
+        </w:tc>
+        <w:tc>
+          <w:tcPr>
+            <w:tcW w:type="dxa" w:w="1152"/>
+            <w:vAlign w:val="center"/>
+          </w:tcPr>
+          <w:p>
+            <w:pPr>
+              <w:spacing w:after="0"/>
+            </w:pPr>
+            <w:r/>
+            <w:r>
+              <w:rPr>
+                <w:rFonts w:ascii="Arial" w:hAnsi="Arial" w:eastAsia="Arial"/>
+                <w:b w:val="0"/>
+                <w:i w:val="0"/>
+                <w:sz w:val="17"/>
+              </w:rPr>
+              <w:t>Nov 2026</w:t>
+            </w:r>
+          </w:p>
+        </w:tc>
+        <w:tc>
+          <w:tcPr>
+            <w:tcW w:type="dxa" w:w="1008"/>
+            <w:vAlign w:val="center"/>
+          </w:tcPr>
+          <w:p>
+            <w:pPr>
+              <w:spacing w:after="0"/>
+            </w:pPr>
+            <w:r/>
+            <w:r>
+              <w:rPr>
+                <w:rFonts w:ascii="Arial" w:hAnsi="Arial" w:eastAsia="Arial"/>
+                <w:b w:val="0"/>
+                <w:i w:val="0"/>
+                <w:sz w:val="17"/>
+              </w:rPr>
+              <w:t>Oral</w:t>
+            </w:r>
+          </w:p>
+        </w:tc>
+        <w:tc>
+          <w:tcPr>
+            <w:tcW w:type="dxa" w:w="4464"/>
+            <w:vAlign w:val="center"/>
+          </w:tcPr>
+          <w:p>
+            <w:pPr>
+              <w:spacing w:after="0"/>
+            </w:pPr>
+            <w:r/>
+            <w:r>
+              <w:rPr>
+                <w:rFonts w:ascii="Arial" w:hAnsi="Arial" w:eastAsia="Arial"/>
+                <w:b w:val="0"/>
+                <w:i w:val="0"/>
+                <w:sz w:val="17"/>
+              </w:rPr>
+              <w:t>The Mayo Obesity Staging Index (MOSI): A Novel Staging Framework for Metabolic Surgery</w:t>
+            </w:r>
+          </w:p>
+        </w:tc>
+        <w:tc>
+          <w:tcPr>
+            <w:tcW w:type="dxa" w:w="2880"/>
+            <w:vAlign w:val="center"/>
+          </w:tcPr>
+          <w:p>
+            <w:pPr>
+              <w:spacing w:after="0"/>
+            </w:pPr>
+            <w:r/>
+            <w:r>
+              <w:rPr>
+                <w:rFonts w:ascii="Arial" w:hAnsi="Arial" w:eastAsia="Arial"/>
+                <w:b w:val="0"/>
+                <w:i w:val="0"/>
+                <w:sz w:val="17"/>
+              </w:rPr>
+              <w:t>Minnesota Surgical Society Annual Meeting 2026 · Best Oral Presentation Award; United States</w:t>
+            </w:r>
+          </w:p>
+        </w:tc>
+      </w:tr>
+      <w:tr>
+        <w:tc>
+          <w:tcPr>
+            <w:tcW w:type="dxa" w:w="504"/>
+            <w:vAlign w:val="center"/>
+          </w:tcPr>
+          <w:p>
+            <w:pPr>
+              <w:spacing w:after="0"/>
+            </w:pPr>
+            <w:r/>
+            <w:r>
+              <w:rPr>
+                <w:rFonts w:ascii="Arial" w:hAnsi="Arial" w:eastAsia="Arial"/>
+                <w:b w:val="0"/>
+                <w:i w:val="0"/>
+                <w:sz w:val="17"/>
+              </w:rPr>
+              <w:t>6</w:t>
+            </w:r>
+          </w:p>
+        </w:tc>
+        <w:tc>
+          <w:tcPr>
+            <w:tcW w:type="dxa" w:w="1152"/>
+            <w:vAlign w:val="center"/>
+          </w:tcPr>
+          <w:p>
+            <w:pPr>
+              <w:spacing w:after="0"/>
+            </w:pPr>
+            <w:r/>
+            <w:r>
+              <w:rPr>
+                <w:rFonts w:ascii="Arial" w:hAnsi="Arial" w:eastAsia="Arial"/>
+                <w:b w:val="0"/>
+                <w:i w:val="0"/>
+                <w:sz w:val="17"/>
+              </w:rPr>
               <w:t>Oct 2026</w:t>
             </w:r>
           </w:p>
@@ -20135,7 +20414,7 @@
                 <w:i w:val="0"/>
                 <w:sz w:val="17"/>
               </w:rPr>
-              <w:t>5</w:t>
+              <w:t>7</w:t>
             </w:r>
           </w:p>
         </w:tc>
@@ -20242,7 +20521,7 @@
                 <w:i w:val="0"/>
                 <w:sz w:val="17"/>
               </w:rPr>
-              <w:t>6</w:t>
+              <w:t>8</w:t>
             </w:r>
           </w:p>
         </w:tc>
@@ -20349,7 +20628,7 @@
                 <w:i w:val="0"/>
                 <w:sz w:val="17"/>
               </w:rPr>
-              <w:t>7</w:t>
+              <w:t>9</w:t>
             </w:r>
           </w:p>
         </w:tc>
@@ -20456,7 +20735,7 @@
                 <w:i w:val="0"/>
                 <w:sz w:val="17"/>
               </w:rPr>
-              <w:t>8</w:t>
+              <w:t>10</w:t>
             </w:r>
           </w:p>
         </w:tc>
@@ -20541,220 +20820,6 @@
                 <w:sz w:val="17"/>
               </w:rPr>
               <w:t>32nd Annual Balfour Surgery Research Symposium · Poster of Distinction; United States</w:t>
-            </w:r>
-          </w:p>
-        </w:tc>
-      </w:tr>
-      <w:tr>
-        <w:tc>
-          <w:tcPr>
-            <w:tcW w:type="dxa" w:w="504"/>
-            <w:vAlign w:val="center"/>
-          </w:tcPr>
-          <w:p>
-            <w:pPr>
-              <w:spacing w:after="0"/>
-            </w:pPr>
-            <w:r/>
-            <w:r>
-              <w:rPr>
-                <w:rFonts w:ascii="Arial" w:hAnsi="Arial" w:eastAsia="Arial"/>
-                <w:b w:val="0"/>
-                <w:i w:val="0"/>
-                <w:sz w:val="17"/>
-              </w:rPr>
-              <w:t>9</w:t>
-            </w:r>
-          </w:p>
-        </w:tc>
-        <w:tc>
-          <w:tcPr>
-            <w:tcW w:type="dxa" w:w="1152"/>
-            <w:vAlign w:val="center"/>
-          </w:tcPr>
-          <w:p>
-            <w:pPr>
-              <w:spacing w:after="0"/>
-            </w:pPr>
-            <w:r/>
-            <w:r>
-              <w:rPr>
-                <w:rFonts w:ascii="Arial" w:hAnsi="Arial" w:eastAsia="Arial"/>
-                <w:b w:val="0"/>
-                <w:i w:val="0"/>
-                <w:sz w:val="17"/>
-              </w:rPr>
-              <w:t>Oct 2026</w:t>
-            </w:r>
-          </w:p>
-        </w:tc>
-        <w:tc>
-          <w:tcPr>
-            <w:tcW w:type="dxa" w:w="1008"/>
-            <w:vAlign w:val="center"/>
-          </w:tcPr>
-          <w:p>
-            <w:pPr>
-              <w:spacing w:after="0"/>
-            </w:pPr>
-            <w:r/>
-            <w:r>
-              <w:rPr>
-                <w:rFonts w:ascii="Arial" w:hAnsi="Arial" w:eastAsia="Arial"/>
-                <w:b w:val="0"/>
-                <w:i w:val="0"/>
-                <w:sz w:val="17"/>
-              </w:rPr>
-              <w:t>Oral</w:t>
-            </w:r>
-          </w:p>
-        </w:tc>
-        <w:tc>
-          <w:tcPr>
-            <w:tcW w:type="dxa" w:w="4464"/>
-            <w:vAlign w:val="center"/>
-          </w:tcPr>
-          <w:p>
-            <w:pPr>
-              <w:spacing w:after="0"/>
-            </w:pPr>
-            <w:r/>
-            <w:r>
-              <w:rPr>
-                <w:rFonts w:ascii="Arial" w:hAnsi="Arial" w:eastAsia="Arial"/>
-                <w:b w:val="0"/>
-                <w:i w:val="0"/>
-                <w:sz w:val="17"/>
-              </w:rPr>
-              <w:t>Area Deprivation Index, Social Determinants of Health, and Weight-Loss Outcomes After Bariatric Surgery: A Retrospective Referral-Center Cohort Study</w:t>
-            </w:r>
-          </w:p>
-        </w:tc>
-        <w:tc>
-          <w:tcPr>
-            <w:tcW w:type="dxa" w:w="2880"/>
-            <w:vAlign w:val="center"/>
-          </w:tcPr>
-          <w:p>
-            <w:pPr>
-              <w:spacing w:after="0"/>
-            </w:pPr>
-            <w:r/>
-            <w:r>
-              <w:rPr>
-                <w:rFonts w:ascii="Arial" w:hAnsi="Arial" w:eastAsia="Arial"/>
-                <w:b w:val="0"/>
-                <w:i w:val="0"/>
-                <w:sz w:val="17"/>
-              </w:rPr>
-              <w:t>Minnesota Surgical Society Annual Meeting 2026; United States</w:t>
-            </w:r>
-          </w:p>
-        </w:tc>
-      </w:tr>
-      <w:tr>
-        <w:tc>
-          <w:tcPr>
-            <w:tcW w:type="dxa" w:w="504"/>
-            <w:vAlign w:val="center"/>
-          </w:tcPr>
-          <w:p>
-            <w:pPr>
-              <w:spacing w:after="0"/>
-            </w:pPr>
-            <w:r/>
-            <w:r>
-              <w:rPr>
-                <w:rFonts w:ascii="Arial" w:hAnsi="Arial" w:eastAsia="Arial"/>
-                <w:b w:val="0"/>
-                <w:i w:val="0"/>
-                <w:sz w:val="17"/>
-              </w:rPr>
-              <w:t>10</w:t>
-            </w:r>
-          </w:p>
-        </w:tc>
-        <w:tc>
-          <w:tcPr>
-            <w:tcW w:type="dxa" w:w="1152"/>
-            <w:vAlign w:val="center"/>
-          </w:tcPr>
-          <w:p>
-            <w:pPr>
-              <w:spacing w:after="0"/>
-            </w:pPr>
-            <w:r/>
-            <w:r>
-              <w:rPr>
-                <w:rFonts w:ascii="Arial" w:hAnsi="Arial" w:eastAsia="Arial"/>
-                <w:b w:val="0"/>
-                <w:i w:val="0"/>
-                <w:sz w:val="17"/>
-              </w:rPr>
-              <w:t>Oct 2026</w:t>
-            </w:r>
-          </w:p>
-        </w:tc>
-        <w:tc>
-          <w:tcPr>
-            <w:tcW w:type="dxa" w:w="1008"/>
-            <w:vAlign w:val="center"/>
-          </w:tcPr>
-          <w:p>
-            <w:pPr>
-              <w:spacing w:after="0"/>
-            </w:pPr>
-            <w:r/>
-            <w:r>
-              <w:rPr>
-                <w:rFonts w:ascii="Arial" w:hAnsi="Arial" w:eastAsia="Arial"/>
-                <w:b w:val="0"/>
-                <w:i w:val="0"/>
-                <w:sz w:val="17"/>
-              </w:rPr>
-              <w:t>Oral</w:t>
-            </w:r>
-          </w:p>
-        </w:tc>
-        <w:tc>
-          <w:tcPr>
-            <w:tcW w:type="dxa" w:w="4464"/>
-            <w:vAlign w:val="center"/>
-          </w:tcPr>
-          <w:p>
-            <w:pPr>
-              <w:spacing w:after="0"/>
-            </w:pPr>
-            <w:r/>
-            <w:r>
-              <w:rPr>
-                <w:rFonts w:ascii="Arial" w:hAnsi="Arial" w:eastAsia="Arial"/>
-                <w:b w:val="0"/>
-                <w:i w:val="0"/>
-                <w:sz w:val="17"/>
-              </w:rPr>
-              <w:t>The Mayo Obesity Staging Index (MOSI): A Novel Staging Framework for Metabolic Surgery</w:t>
-            </w:r>
-          </w:p>
-        </w:tc>
-        <w:tc>
-          <w:tcPr>
-            <w:tcW w:type="dxa" w:w="2880"/>
-            <w:vAlign w:val="center"/>
-          </w:tcPr>
-          <w:p>
-            <w:pPr>
-              <w:spacing w:after="0"/>
-            </w:pPr>
-            <w:r/>
-            <w:r>
-              <w:rPr>
-                <w:rFonts w:ascii="Arial" w:hAnsi="Arial" w:eastAsia="Arial"/>
-                <w:b w:val="0"/>
-                <w:i w:val="0"/>
-                <w:sz w:val="17"/>
-              </w:rPr>
-              <w:t>Minnesota Surgical Society Annual Meeting 2026; United States</w:t>
             </w:r>
           </w:p>
         </w:tc>

</xml_diff>